<commit_message>
fix: recalcular validacion experta desde la cascada real y actualizar cifras del articulo
</commit_message>
<xml_diff>
--- a/paper/articulo-cientifico.docx
+++ b/paper/articulo-cientifico.docx
@@ -433,7 +433,7 @@
         <w:ind w:left="720"/>
       </w:pPr>
       <w:r>
-        <w:t>El objetivo de esta investigación fue desarrollar y evaluar Glycine Vision, un sistema móvil de apoyo al triaje fitosanitario en soya (Glycine max) que detecta enfermedades foliares y estima su severidad con inferencia local. Se aplicó un diseño experimental cuantitativo con una arquitectura de tres etapas: segmentación hoja–fondo (U-Net con codificador ResNet50) y dos clasificadores en cascada de doble entrada, sana/enferma (EfficientNetB1) y de patógeno en cinco categorías (EfficientNetB0). La severidad se cuantificó como porcentaje de área foliar afectada mediante reglas de color en CIELab. Los modelos se entrenaron con transferencia de aprendizaje, normalización Shades-of-Gray y aumento de datos, y se exportaron a TensorFlow Lite en variantes float32 e int8. Sobre conjuntos de prueba independientes, la segmentación alcanzó recall de hoja de 0.977 (Dice 0.885); el estado sanitario, exactitud de 0.980 con recall perfecto en la clase enferma; y el patógeno, exactitud de 0.969 y F1 macro de 0.968. Frente a un evaluador experto (n = 60), la severidad concordó estrechamente (r = 0.967; MAE 5.7 %). El sistema es una herramienta preliminar de apoyo al monitoreo foliar, no un sustituto del criterio agronómico, y requiere validación local adicional.</w:t>
+        <w:t xml:space="preserve">El objetivo de esta investigación fue desarrollar y evaluar Glycine Vision, un sistema móvil de apoyo al triaje fitosanitario en soya (Glycine max) que detecta enfermedades foliares y estima su severidad con inferencia local. Se aplicó un diseño experimental cuantitativo con una arquitectura de tres etapas: segmentación hoja–fondo (U-Net con codificador ResNet50) y dos clasificadores en cascada de doble entrada, sana/enferma (EfficientNetB1) y de patógeno en cinco categorías (EfficientNetB0). La severidad se cuantificó como porcentaje de área foliar afectada mediante reglas de color en CIELab. Los modelos se entrenaron con transferencia de aprendizaje, normalización Shades-of-Gray y aumento de datos, y se exportaron a TensorFlow Lite en variantes float32 e int8. Sobre conjuntos de prueba independientes, la segmentación alcanzó recall de hoja de 0.977 (Dice 0.885); el estado sanitario, exactitud de 0.980 con recall perfecto en la clase enferma; y el patógeno, exactitud de 0.969 y F1 macro de 0.968. Frente a un evaluador experto (n = 60), la severidad concordó estrechamente (r = 0.953; MAE 6.5 %). El sistema es una herramienta preliminar de apoyo al monitoreo foliar, no un sustituto del criterio agronómico, y requiere validación local adicional.</w:t>
       </w:r>
     </w:p>
     <w:p>
@@ -471,11 +471,7 @@
         <w:ind w:left="720"/>
       </w:pPr>
       <w:r>
-        <w:t xml:space="preserve">The objective of this research was to develop and evaluate Glycine Vision, a mobile decision-support tool for phytosanitary triage in soybean (Glycine max) that detects foliar diseases and estimates their severity with on-device inference. A quantitative experimental design was applied, with a three-stage architecture: leaf–background segmentation (U-Net with a ResNet50 encoder) and two </w:t>
-      </w:r>
-      <w:r>
-        <w:lastRenderedPageBreak/>
-        <w:t>cascaded dual-input classifiers, healthy/diseased (EfficientNetB1) and pathogen across five categories (EfficientNetB0). Severity was quantified as the percentage of affected leaf area using CIELab color rules. Models were trained with transfer learning, Shades-of-Gray normalization and data augmentation, and exported to TensorFlow Lite in float32 and int8 variants. On independent test sets, segmentation reached a leaf recall of 0.977 (Dice 0.885); the health classifier, an accuracy of 0.980 with perfect recall on the diseased class; and the pathogen classifier, an accuracy of 0.969 and macro F1 of 0.968. Against an expert evaluator (n = 60), severity agreed closely (r = 0.967; MAE 5.7 %). The system is a preliminary tool to support foliar monitoring, not a substitute for agronomic judgment, and requires additional local validation.</w:t>
+        <w:t xml:space="preserve">The objective of this research was to develop and evaluate Glycine Vision, a mobile decision-support tool for phytosanitary triage in soybean (Glycine max) that detects foliar diseases and estimates their severity with on-device inference. A quantitative experimental design was applied, with a three-stage architecture: leaf–background segmentation (U-Net with a ResNet50 encoder) and two cascaded dual-input classifiers, healthy/diseased (EfficientNetB1) and pathogen across five categories (EfficientNetB0). Severity was quantified as the percentage of affected leaf area using CIELab color rules. Models were trained with transfer learning, Shades-of-Gray normalization and data augmentation, and exported to TensorFlow Lite in float32 and int8 variants. On independent test sets, segmentation reached a leaf recall of 0.977 (Dice 0.885); the health classifier, an accuracy of 0.980 with perfect recall on the diseased class; and the pathogen classifier, an accuracy of 0.969 and macro F1 of 0.968. Against an expert evaluator (n = 60), severity agreed closely (r = 0.953; MAE 6.5 %). The system is a preliminary tool to support foliar monitoring, not a substitute for agronomic judgment, and requires additional local validation.</w:t>
       </w:r>
     </w:p>
     <w:p>
@@ -1450,19 +1446,15 @@
         <w:pStyle w:val="Textoindependiente"/>
       </w:pPr>
       <w:r>
-        <w:t xml:space="preserve">Severidad. La concordancia con el experto fue alta (Tabla 2): r = 0.967, CCC = 0.941, MAE = 5.7 % y RMSE = 7.4 %. El Bland-Altman arrojó un sesgo de −5.0 % y límites de </w:t>
-      </w:r>
-      <w:r>
-        <w:lastRenderedPageBreak/>
-        <w:t>acuerdo de [−15.8 %, 5.9 %]; el 83.3 % quedó dentro de ±10 puntos y el 100 % dentro de ±20 (Figura 4).</w:t>
-      </w:r>
-    </w:p>
-    <w:p>
-      <w:pPr>
-        <w:pStyle w:val="Textoindependiente"/>
-      </w:pPr>
-      <w:r>
-        <w:t>Patógeno. La app alcanzó exactitud de 0.950 (F1 macro = 0.952) y el experto, 0.867 (F1 macro 0.872) frente a la verdad de campo. En los discordantes, la app acertó en cinco que el experto erró, sin casos inversos; McNemar no alcanzó significancia (p = 0.0625), interpretable como desempeño comparable con tendencia favorable no concluyente por el tamaño de muestra.</w:t>
+        <w:t xml:space="preserve">Severidad. La concordancia con el experto fue alta (Tabla 2): r = 0.953, CCC = 0.923, MAE = 6.5 % y RMSE = 8.5 %. El Bland-Altman arrojó un sesgo de −5.4 % y límites de acuerdo de [−18.3 %, 7.5 %]; el 71.7 % quedó dentro de ±10 puntos y el 100 % dentro de ±20 (Figura 4).</w:t>
+      </w:r>
+    </w:p>
+    <w:p>
+      <w:pPr>
+        <w:pStyle w:val="Textoindependiente"/>
+      </w:pPr>
+      <w:r>
+        <w:t xml:space="preserve">Patógeno. La app alcanzó exactitud de 0.917 (F1 macro = 0.914) y el experto, 0.883 (F1 macro 0.888) frente a la verdad de campo. Las discordancias se repartieron en ambos sentidos: la app acertó en seis casos que el experto erró y el experto en cuatro que erró la app. La prueba de McNemar no detectó diferencia (p = 0.754), de modo que ambos desempeños son estadísticamente indistinguibles con este tamaño de muestra.</w:t>
       </w:r>
     </w:p>
     <w:p>
@@ -1574,7 +1566,7 @@
               <w:spacing w:after="40"/>
             </w:pPr>
             <w:r>
-              <w:t>0.967</w:t>
+              <w:t xml:space="preserve">0.953</w:t>
             </w:r>
           </w:p>
         </w:tc>
@@ -1602,7 +1594,7 @@
               <w:spacing w:after="40"/>
             </w:pPr>
             <w:r>
-              <w:t>0.941</w:t>
+              <w:t xml:space="preserve">0.923</w:t>
             </w:r>
           </w:p>
         </w:tc>
@@ -1630,7 +1622,7 @@
               <w:spacing w:after="40"/>
             </w:pPr>
             <w:r>
-              <w:t>5.7</w:t>
+              <w:t xml:space="preserve">6.5</w:t>
             </w:r>
           </w:p>
         </w:tc>
@@ -1658,7 +1650,7 @@
               <w:spacing w:after="40"/>
             </w:pPr>
             <w:r>
-              <w:t>7.4</w:t>
+              <w:t xml:space="preserve">8.5</w:t>
             </w:r>
           </w:p>
         </w:tc>
@@ -1686,7 +1678,7 @@
               <w:spacing w:after="40"/>
             </w:pPr>
             <w:r>
-              <w:t>−5.0</w:t>
+              <w:t xml:space="preserve">−5.4</w:t>
             </w:r>
           </w:p>
         </w:tc>
@@ -1714,7 +1706,7 @@
               <w:spacing w:after="40"/>
             </w:pPr>
             <w:r>
-              <w:t>[−15.8, 5.9]</w:t>
+              <w:t xml:space="preserve">[−18.3, 7.5]</w:t>
             </w:r>
           </w:p>
         </w:tc>
@@ -1742,7 +1734,7 @@
               <w:spacing w:after="40"/>
             </w:pPr>
             <w:r>
-              <w:t>83.3 %</w:t>
+              <w:t xml:space="preserve">71.7 %</w:t>
             </w:r>
           </w:p>
         </w:tc>
@@ -1770,7 +1762,7 @@
               <w:spacing w:after="40"/>
             </w:pPr>
             <w:r>
-              <w:t>100 %</w:t>
+              <w:t xml:space="preserve">100 %</w:t>
             </w:r>
           </w:p>
         </w:tc>
@@ -3388,7 +3380,7 @@
         <w:pStyle w:val="Textoindependiente"/>
       </w:pPr>
       <w:r>
-        <w:t>La inferencia se ejecuta en el dispositivo sin conectividad, lo que preserva la privacidad al no transmitir imágenes. La severidad CIELab ofrece trazabilidad visual y desagrega clorosis, necrosis y defoliación (MAE 5.7 % vs. experto), y la integración de clima (Open-Meteo) ajusta la urgencia sin confirmar el diagnóstico.</w:t>
+        <w:t xml:space="preserve">La inferencia se ejecuta en el dispositivo sin conectividad, lo que preserva la privacidad al no transmitir imágenes. La severidad CIELab ofrece trazabilidad visual y desagrega clorosis, necrosis y defoliación (MAE 6.5 % vs. experto), y la integración de clima (Open-Meteo) ajusta la urgencia sin confirmar el diagnóstico.</w:t>
       </w:r>
     </w:p>
     <w:p>
@@ -3465,7 +3457,7 @@
         <w:pStyle w:val="Textoindependiente"/>
       </w:pPr>
       <w:r>
-        <w:t>Se desarrolló y evaluó Glycine Vision, un sistema modular de apoyo al triaje fitosanitario en soya que integra segmentación hoja–fondo, clasificación en cascada de doble entrada y estimación interpretable de severidad por CIELab con inferencia local. Sobre test independientes alcanzó recall de hoja de 0.977, exactitud de 0.980 en el estado sanitario (recall perfecto en la clase enferma) y 0.969 en el patógeno (F1 macro 0.968); frente al experto, la severidad concordó (r = 0.967; MAE 5.7 %) y el diagnóstico fue comparable (0.95 vs. 0.87; McNemar p = 0.0625). Un estudio de ablación al presupuesto completo identificó el aislamiento de la hoja mediante M_seg como el componente de mayor aporte a la clasificación del patógeno.</w:t>
+        <w:t xml:space="preserve">Se desarrolló y evaluó Glycine Vision, un sistema modular de apoyo al triaje fitosanitario en soya que integra segmentación hoja–fondo, clasificación en cascada de doble entrada y estimación interpretable de severidad por CIELab con inferencia local. Sobre test independientes alcanzó recall de hoja de 0.977, exactitud de 0.980 en el estado sanitario (recall perfecto en la clase enferma) y 0.969 en el patógeno (F1 macro 0.968); frente al experto, la severidad concordó (r = 0.953; MAE 6.5 %) y el diagnóstico resultó estadísticamente indistinguible (0.917 vs. 0.883; McNemar p = 0.754). Un estudio de ablación al presupuesto completo identificó el aislamiento de la hoja mediante M_seg como el componente de mayor aporte a la clasificación del patógeno.</w:t>
       </w:r>
     </w:p>
     <w:p>

</xml_diff>

<commit_message>
docs: sincronizar articulo, trazabilidad y documentacion con la evidencia actual
</commit_message>
<xml_diff>
--- a/paper/articulo-cientifico.docx
+++ b/paper/articulo-cientifico.docx
@@ -433,7 +433,7 @@
         <w:ind w:left="720"/>
       </w:pPr>
       <w:r>
-        <w:t xml:space="preserve">El objetivo de esta investigación fue desarrollar y evaluar Glycine Vision, un sistema móvil de apoyo al triaje fitosanitario en soya (Glycine max) que detecta enfermedades foliares y estima su severidad con inferencia local. Se aplicó un diseño experimental cuantitativo con una arquitectura de tres etapas: segmentación hoja–fondo (U-Net con codificador ResNet50) y dos clasificadores en cascada de doble entrada, sana/enferma (EfficientNetB1) y de patógeno en cinco categorías (EfficientNetB0). La severidad se cuantificó como porcentaje de área foliar afectada mediante reglas de color en CIELab. Los modelos se entrenaron con transferencia de aprendizaje, normalización Shades-of-Gray y aumento de datos, y se exportaron a TensorFlow Lite en variantes float32 e int8. Sobre conjuntos de prueba independientes, la segmentación alcanzó recall de hoja de 0.977 (Dice 0.885); el estado sanitario, exactitud de 0.980 con recall perfecto en la clase enferma; y el patógeno, exactitud de 0.969 y F1 macro de 0.968. Frente a un evaluador experto (n = 60), la severidad concordó estrechamente (r = 0.953; MAE 6.5 %). El sistema es una herramienta preliminar de apoyo al monitoreo foliar, no un sustituto del criterio agronómico, y requiere validación local adicional.</w:t>
+        <w:t xml:space="preserve">El objetivo de esta investigación fue desarrollar y evaluar Glycine Vision, un sistema móvil de apoyo al triaje fitosanitario en soya (Glycine max) que detecta enfermedades foliares y estima su severidad con inferencia local. Se aplicó un diseño experimental cuantitativo con una arquitectura de tres etapas: segmentación hoja–fondo (U-Net con codificador ResNet50) y dos clasificadores en cascada de doble entrada, sana/enferma (EfficientNetB1) y de categoría de afección foliar en cinco clases (EfficientNetB0). La severidad se cuantificó como porcentaje de área foliar afectada mediante reglas de color en CIELab. Los modelos se entrenaron con transferencia de aprendizaje, normalización Shades-of-Gray y aumento de datos, y se exportaron a TensorFlow Lite en variantes float32 e int8. Sobre conjuntos de prueba independientes, la segmentación alcanzó recall de hoja de 0.974 (Dice 0.885); el estado sanitario, exactitud de 0.980 con recall perfecto en la clase enferma; y la categoría de afección, exactitud de 0.969 y F1 macro de 0.968. Frente a un evaluador experto (n = 60), la severidad concordó estrechamente (r = 0.953; MAE 6.5 %). El sistema es una herramienta preliminar de apoyo al monitoreo foliar, no un sustituto del criterio agronómico, y requiere validación local adicional.</w:t>
       </w:r>
     </w:p>
     <w:p>
@@ -471,7 +471,7 @@
         <w:ind w:left="720"/>
       </w:pPr>
       <w:r>
-        <w:t xml:space="preserve">The objective of this research was to develop and evaluate Glycine Vision, a mobile decision-support tool for phytosanitary triage in soybean (Glycine max) that detects foliar diseases and estimates their severity with on-device inference. A quantitative experimental design was applied, with a three-stage architecture: leaf–background segmentation (U-Net with a ResNet50 encoder) and two cascaded dual-input classifiers, healthy/diseased (EfficientNetB1) and pathogen across five categories (EfficientNetB0). Severity was quantified as the percentage of affected leaf area using CIELab color rules. Models were trained with transfer learning, Shades-of-Gray normalization and data augmentation, and exported to TensorFlow Lite in float32 and int8 variants. On independent test sets, segmentation reached a leaf recall of 0.977 (Dice 0.885); the health classifier, an accuracy of 0.980 with perfect recall on the diseased class; and the pathogen classifier, an accuracy of 0.969 and macro F1 of 0.968. Against an expert evaluator (n = 60), severity agreed closely (r = 0.953; MAE 6.5 %). The system is a preliminary tool to support foliar monitoring, not a substitute for agronomic judgment, and requires additional local validation.</w:t>
+        <w:t xml:space="preserve">The objective of this research was to develop and evaluate Glycine Vision, a mobile decision-support tool for phytosanitary triage in soybean (Glycine max) that detects foliar diseases and estimates their severity with on-device inference. A quantitative experimental design was applied, with a three-stage architecture: leaf–background segmentation (U-Net with a ResNet50 encoder) and two cascaded dual-input classifiers, healthy/diseased (EfficientNetB1) and pathogen across five categories (EfficientNetB0). Severity was quantified as the percentage of affected leaf area using CIELab color rules. Models were trained with transfer learning, Shades-of-Gray normalization and data augmentation, and exported to TensorFlow Lite in float32 and int8 variants. On independent test sets, segmentation reached a leaf recall of 0.974 (Dice 0.885); the health classifier, an accuracy of 0.980 with perfect recall on the diseased class; and the pathogen classifier, an accuracy of 0.969 and macro F1 of 0.968. Against an expert evaluator (n = 60), severity agreed closely (r = 0.953; MAE 6.5 %). The system is a preliminary tool to support foliar monitoring, not a substitute for agronomic judgment, and requires additional local validation.</w:t>
       </w:r>
     </w:p>
     <w:p>
@@ -523,7 +523,7 @@
         <w:pStyle w:val="Textoindependiente"/>
       </w:pPr>
       <w:r>
-        <w:t>Este trabajo cierra la brecha entre el rendimiento en laboratorio y el desempeño en campo con una herramienta que funciona en el teléfono del productor, sin conectividad y con criterios trazables, incorporando normalización cromática, aumento de datos y segmentación para tolerar la captura con smartphone. El objetivo fue desarrollar y evaluar un sistema de apoyo al triaje fitosanitario en soya que detecte enfermedades foliares y estime su severidad con inferencia local, con cuatro objetivos específicos: segmentar la hoja de forma robusta, clasificar el estado sanitario y el patógeno en cascada, cuantificar la severidad de forma interpretable y desplegar el sistema cuantizado para uso sin conexión.</w:t>
+        <w:t xml:space="preserve">Este trabajo aborda parcialmente la brecha entre el rendimiento en laboratorio y el desempeño en campo con una herramienta que funciona en el teléfono del productor, sin conectividad y con criterios trazables, incorporando normalización cromática, aumento de datos y segmentación para tolerar la captura con smartphone. El objetivo fue desarrollar y evaluar un sistema de apoyo al triaje fitosanitario en soya que detecte enfermedades foliares y estime su severidad con inferencia local, con cuatro objetivos específicos: segmentar la hoja de forma robusta, clasificar el estado sanitario y la categoría de afección en cascada, cuantificar la severidad de forma interpretable y desplegar el sistema cuantizado para uso sin conexión.</w:t>
       </w:r>
     </w:p>
     <w:p>
@@ -566,11 +566,7 @@
         <w:pStyle w:val="Textoindependiente"/>
       </w:pPr>
       <w:r>
-        <w:t xml:space="preserve">Las enfermedades se agruparon en cinco categorías por patógeno: bacterianas, fúngicas, roya, virales y plagas/insectos. El pipeline aplicó filtros de calidad (apertura válida, resolución mínima 224 × 224 px, RGB) y deduplicación por MD5 y hash perceptual (pHash) con registro por tarea, procesando el entrenamiento antes que la prueba para evitar la fuga entrenamiento–prueba. Con semilla fija (42) se definieron conjuntos 80/20 y un test independiente (100 imágenes/clase sanitario, 70/clase patógeno). Para segmentación se fusionaron máscaras COCO propias (Roboflow) y SoyCotton (Segreto </w:t>
-      </w:r>
-      <w:r>
-        <w:lastRenderedPageBreak/>
-        <w:t>et al., 2026) como una única clase hoja, con partición 75/25 y 15 % de validación.</w:t>
+        <w:t xml:space="preserve">Las imágenes se agruparon en cinco categorías operativas de afección foliar, definidas por el agente causal declarado en la fuente y por su signo visual: bacterianas, fúngicas, roya, virales y plagas/insectos. La agrupación no es una taxonomía patogénica estricta: la roya (Phakopsora pachyrhizi) es un hongo, pero se mantiene separada de las demás fúngicas por su relevancia epidemiológica en la región y por su signo característico, y plagas/insectos corresponde a daño por artrópodos, no a un patógeno. El pipeline aplicó filtros de calidad (apertura válida, resolución mínima 224 × 224 px, RGB) y deduplicación por MD5 y hash perceptual (pHash) con registro por tarea, procesando el entrenamiento antes que la prueba para evitar la fuga entrenamiento–prueba. Con semilla fija (42) se definieron conjuntos 80/20 y un test independiente (100 imágenes/clase sanitario, 70/clase de afección). Para segmentación se fusionaron máscaras COCO propias (Roboflow) y SoyCotton (Segreto et al., 2026) como una única clase hoja, con partición 75/25 y 15 % de validación.</w:t>
       </w:r>
     </w:p>
     <w:p>
@@ -608,23 +604,23 @@
         <w:pStyle w:val="Textoindependiente"/>
       </w:pPr>
       <w:r>
-        <w:t>Modelo de segmentación (M_seg). U-Net con codificador ResNet50 preentrenado en ImageNet (He et al., 2016; Ronneberger et al., 2015), entrada 256 × 256 px y dos clases (fondo/hoja); solo delimita la hoja y delega estado, patógeno y severidad a etapas posteriores. La referencia experta fusionó máscaras COCO propias (Roboflow) y SoyCotton (Segreto et al., 2026). La pérdida combinó entropía cruzada y Dice; la métrica principal fue el recall de hoja. Se entrenó en dos fases con parada temprana y posprocesamiento de mayor componente conexo.</w:t>
-      </w:r>
-    </w:p>
-    <w:p>
-      <w:pPr>
-        <w:pStyle w:val="Textoindependiente"/>
-      </w:pPr>
-      <w:r>
-        <w:t>Clasificadores en cascada de doble entrada. M1 (EfficientNetB1, 240 × 240 px) determina sana/enferma; M2 (EfficientNetB0, 224 × 224 px) clasifica el patógeno en cinco categorías con softmax de etiqueta única. Ambos reciben imagen original y hoja aislada (fondo negro por la máscara de M_seg) mediante un codificador compartido cuyos vectores se concatenan antes de la cabeza. Se emplearon transferencia de aprendizaje (Tan &amp; Le, 2019), aumento con Albumentations y promediado exponencial de pesos (EMA); como pérdida, focal binaria balanceada en M1 y entropía cruzada con suavizado de etiquetas en M2.</w:t>
-      </w:r>
-    </w:p>
-    <w:p>
-      <w:pPr>
-        <w:pStyle w:val="Textoindependiente"/>
-      </w:pPr>
-      <w:r>
-        <w:t>Normalización cromática. En entrenamiento e inferencia se aplicó Shades-of-Gray (Minkowski p = 6, ganancia acotada a [0.6, 1.6]) (Finlayson &amp; Trezzi, 2004), con fórmula idéntica en ambos para garantizar invariancia a la iluminación y paridad.</w:t>
+        <w:t xml:space="preserve">Modelo de segmentación (M_seg). U-Net con codificador ResNet50 preentrenado en ImageNet (He et al., 2016; Ronneberger et al., 2015), entrada 256 × 256 px y dos clases (fondo/hoja); solo delimita la hoja y delega estado, categoría de afección y severidad a etapas posteriores. La referencia experta fusionó máscaras COCO propias (Roboflow) y SoyCotton (Segreto et al., 2026). La pérdida combinó entropía cruzada y Dice; la métrica principal fue el recall de hoja. Se entrenó en dos fases con parada temprana y posprocesamiento de mayor componente conexo.</w:t>
+      </w:r>
+    </w:p>
+    <w:p>
+      <w:pPr>
+        <w:pStyle w:val="Textoindependiente"/>
+      </w:pPr>
+      <w:r>
+        <w:t xml:space="preserve">Clasificadores en cascada de doble entrada. M1 (EfficientNetB1, 240 × 240 px) determina sana/enferma; M2 (EfficientNetB0, 224 × 224 px) asigna la categoría de afección en cinco clases con softmax de etiqueta única. Ambos reciben imagen original y hoja aislada (fondo negro por la máscara de M_seg) mediante un codificador compartido cuyos vectores se concatenan antes de la cabeza. Se emplearon transferencia de aprendizaje (Tan &amp; Le, 2019), aumento con Albumentations y promediado exponencial de pesos (EMA); como pérdida, focal binaria balanceada en M1 y entropía cruzada con suavizado de etiquetas en M2.</w:t>
+      </w:r>
+    </w:p>
+    <w:p>
+      <w:pPr>
+        <w:pStyle w:val="Textoindependiente"/>
+      </w:pPr>
+      <w:r>
+        <w:t xml:space="preserve">Normalización cromática. En entrenamiento e inferencia se aplicó Shades-of-Gray (Minkowski p = 6, ganancia acotada a [0.6, 1.6]) (Finlayson &amp; Trezzi, 2004), con fórmula idéntica en ambos para mitigar la variabilidad cromática de la captura y mantener la paridad entre entrenamiento e inferencia. Su aporte fuera del dominio de entrenamiento no se midió (véase Tabla 6 y Limitaciones).</w:t>
       </w:r>
     </w:p>
     <w:p>
@@ -635,30 +631,23 @@
         <w:rPr>
           <w:b/>
         </w:rPr>
-        <w:t xml:space="preserve">Estimación de severidad por color (CIELab). </w:t>
-      </w:r>
-      <w:r>
-        <w:t xml:space="preserve">Se cuantificó como porcentaje de área foliar afectada (Bock et al., 2022), dentro de la región segmentada y en CIELab por su uniformidad perceptual (da Silva et al., 2022). Cada píxel foliar se clasificó como sano, clorótico, necrótico o defoliado mediante umbrales sobre L*, a* y b* (detallados en el repositorio); la severidad agregada es el cociente entre área sintomática y área foliar </w:t>
-      </w:r>
-      <w:r>
-        <w:lastRenderedPageBreak/>
-        <w:t>esperada, y se activa solo si M1 clasifica la hoja como enferma. Niveles: mínima (&lt; 5 %), leve (5–15 %), moderada (15–35 %), severa (35–60 %) y crítica (≥ 60 %).</w:t>
-      </w:r>
-    </w:p>
-    <w:p>
-      <w:pPr>
-        <w:pStyle w:val="Textoindependiente"/>
-      </w:pPr>
-      <w:r>
-        <w:t>Despliegue e inferencia local. Los tres modelos se exportaron a TensorFlow Lite en variantes float32 e int8 para ejecución sin conexión. La configuración desplegada, idéntica en la aplicación y en el servicio de respaldo, emplea el segmentador y el clasificador de estado sanitario cuantizados a int8 y el clasificador de patógeno en float32; la elección se sustenta en la evaluación de las variantes exportadas (Tabla 4). La app Flutter implementa el flujo completo (segmentación → hoja aislada → M1 → M2 → severidad → superposición) y genera recomendaciones según enfermedad, severidad y clima sobre una base de conocimiento agronómico; las dosis y sus fórmulas se detallan en el repositorio. Los modelos entrenados, en sus variantes float32 e int8, se publican en Hugging Face (Jaldín Torrico &amp; Ramírez Vallejos, 2026b).</w:t>
-      </w:r>
-    </w:p>
-    <w:p>
-      <w:pPr>
-        <w:pStyle w:val="Textoindependiente"/>
-      </w:pPr>
-      <w:r>
-        <w:t>La decisión y la intensidad del tratamiento siguen el umbral de acción del manejo integrado: el sistema consulta Open-Meteo (temperatura, humedad, precipitación y punto de rocío) y, mediante reglas específicas por patógeno, desplaza el nivel de severidad un escalón y adelanta o retrasa la ventana estimada de aparición. La base de conocimiento aporta además las prácticas de aplicación (horas frescas, cobertura, período de carencia) y la verificación de incompatibilidades entre productos. Son orientativas y no sustituyen el criterio agronómico (véase Uso responsable).</w:t>
+        <w:t xml:space="preserve">Estimación de severidad por color (CIELab). Se cuantificó como porcentaje de área foliar afectada (Bock et al., 2022), dentro de la región segmentada y en CIELab por su uniformidad perceptual (da Silva et al., 2022). Cada píxel de la hoja se clasificó como sano, clorótico o necrótico mediante umbrales sobre L*, a* y b* (detallados en el repositorio); los huecos interiores encerrados por el contorno foliar se contabilizan aparte como pérdida de tejido, sin que ello implique medir defoliación en sentido fitopatológico. La severidad agregada es el cociente entre área sintomática y área foliar esperada, y se activa solo si M1 clasifica la hoja como enferma. Niveles: mínima (&lt; 5 %), leve (5–15 %), moderada (15–35 %), severa (35–60 %) y crítica (≥ 60 %).</w:t>
+      </w:r>
+    </w:p>
+    <w:p>
+      <w:pPr>
+        <w:pStyle w:val="Textoindependiente"/>
+      </w:pPr>
+      <w:r>
+        <w:t xml:space="preserve">Despliegue e inferencia local. Los tres modelos se exportaron a TensorFlow Lite en variantes float32 e int8 para ejecución sin conexión. La configuración desplegada, idéntica en la aplicación y en el servicio de respaldo, emplea el segmentador y el clasificador de estado sanitario cuantizados a int8 y el clasificador de categoría de afección en float32; la elección se sustenta en la evaluación de las variantes exportadas (Tabla 4). La app Flutter implementa el flujo completo (segmentación → hoja aislada → M1 → M2 → severidad → superposición) y genera orientaciones de manejo según la afección, la severidad y el clima sobre una base de conocimiento agronómico. El sistema no calcula dosis, intervalos ni mezclas: esas decisiones corresponden al profesional responsable y deben verificarse contra la etiqueta vigente del producto y el registro del SENASAG. Los modelos entrenados, en sus variantes float32 e int8, se publican en Hugging Face (Jaldín Torrico &amp; Ramírez Vallejos, 2026b).</w:t>
+      </w:r>
+    </w:p>
+    <w:p>
+      <w:pPr>
+        <w:pStyle w:val="Textoindependiente"/>
+      </w:pPr>
+      <w:r>
+        <w:t xml:space="preserve">La decisión y la intensidad del tratamiento siguen el umbral de acción del manejo integrado: el sistema consulta Open-Meteo (temperatura, humedad, precipitación y punto de rocío) y, mediante reglas específicas por categoría de afección, desplaza el nivel de severidad un escalón y adelanta o retrasa la ventana estimada de aparición. La base de conocimiento aporta además las prácticas de aplicación (horas frescas, cobertura, período de carencia) y la verificación de incompatibilidades entre productos. Son orientativas y no sustituyen el criterio agronómico (véase Uso responsable).</w:t>
       </w:r>
     </w:p>
     <w:p>
@@ -677,7 +666,7 @@
         <w:pStyle w:val="Textoindependiente"/>
       </w:pPr>
       <w:r>
-        <w:t>M1 y M2 se evaluaron sobre el test independiente con la misma doble entrada del entrenamiento (exactitud, precisión, recall, F1, soporte y matrices de confusión, además del error de calibración esperado y máximo y el puntaje de Brier); M_seg, sobre el 25 % held-out de las máscaras COCO (recall de hoja, Dice, IoU). Una validación de uso comparó, sobre 60 hojas (10 por categoría, un evaluador), la severidad y el patógeno de la app frente al experto, con la etiqueta del dataset como verdad de campo; la severidad con Pearson, CCC, MAE, RMSE y Bland-Altman, y el patógeno con exactitud, F1 macro y McNemar.</w:t>
+        <w:t xml:space="preserve">M1 y M2 se evaluaron sobre el test independiente con la misma doble entrada del entrenamiento (exactitud, precisión, recall, F1, soporte y matrices de confusión, además del error de calibración esperado y máximo y el puntaje de Brier); M_seg, sobre el 25 % held-out de las máscaras COCO (recall de hoja, Dice, IoU). Una validación de uso comparó, sobre 60 hojas (10 por categoría, un evaluador), la severidad y la categoría de afección de la app frente al experto, con la etiqueta del dataset como verdad de campo; la severidad con Pearson, CCC, MAE, RMSE y Bland-Altman, y la categoría con exactitud, F1 macro y McNemar.</w:t>
       </w:r>
     </w:p>
     <w:p>
@@ -784,7 +773,7 @@
         <w:pStyle w:val="Textoindependiente"/>
       </w:pPr>
       <w:r>
-        <w:t>La Tabla 1 resume el desempeño de los tres modelos. M_seg, sobre el 25 % held-out de las máscaras expertas COCO, alcanzó recall de hoja de 0.977, Dice de 0.885 e IoU de 0.808 en un conjunto con doseles densos y fondos de campo exigentes.</w:t>
+        <w:t xml:space="preserve">La Tabla 1 resume el desempeño de los tres modelos. M_seg, sobre el 25 % held-out de las máscaras expertas COCO, alcanzó recall de hoja de 0.974, Dice de 0.885 e IoU de 0.808 en un conjunto con doseles densos y fondos de campo exigentes.</w:t>
       </w:r>
     </w:p>
     <w:p>
@@ -951,7 +940,7 @@
               <w:spacing w:after="40"/>
             </w:pPr>
             <w:r>
-              <w:t>0.977 (0.885; 0.808)</w:t>
+              <w:t xml:space="preserve">0.974 (0.885; 0.808)</w:t>
             </w:r>
           </w:p>
         </w:tc>
@@ -1159,7 +1148,7 @@
         <w:rPr>
           <w:rFonts w:ascii="Arial" w:hAnsi="Arial"/>
         </w:rPr>
-        <w:t>Modelo 2: Tipo de Patógeno</w:t>
+        <w:t xml:space="preserve">Modelo 2: Categoría de Afección Foliar</w:t>
       </w:r>
     </w:p>
     <w:p>
@@ -1261,7 +1250,7 @@
         <w:pStyle w:val="Textoindependiente"/>
       </w:pPr>
       <w:r>
-        <w:t>La Figura 3 ilustra el flujo: M_seg delimita la hoja, M1 determina el estado, M2 (si está enferma) identifica el patógeno y el análisis CIELab produce la superposición de tres estados con el porcentaje de severidad, con trazabilidad visual entre la región atribuida y el síntoma.</w:t>
+        <w:t xml:space="preserve">La Figura 3 ilustra el flujo: M_seg delimita la hoja, M1 determina el estado, M2 (si está enferma) asigna la categoría de afección y el análisis CIELab produce la superposición de tres estados con el porcentaje de severidad, con trazabilidad visual entre la región atribuida y el síntoma.</w:t>
       </w:r>
     </w:p>
     <w:p>
@@ -1438,7 +1427,7 @@
         <w:pStyle w:val="Textoindependiente"/>
       </w:pPr>
       <w:r>
-        <w:t>Se evaluaron 60 hojas (10 por categoría) registrando la severidad y el patógeno de la app y del experto; la etiqueta del dataset fue la verdad de campo del patógeno, una limitación del contraste (véase Limitaciones).</w:t>
+        <w:t xml:space="preserve">Se evaluaron 60 hojas (10 por categoría) registrando la severidad y la categoría de afección de la app y del experto; la etiqueta del conjunto de datos fue la verdad de campo de la categoría, una limitación del contraste (véase Limitaciones).</w:t>
       </w:r>
     </w:p>
     <w:p>
@@ -1454,7 +1443,7 @@
         <w:pStyle w:val="Textoindependiente"/>
       </w:pPr>
       <w:r>
-        <w:t xml:space="preserve">Patógeno. La app alcanzó exactitud de 0.917 (F1 macro = 0.914) y el experto, 0.883 (F1 macro 0.888) frente a la verdad de campo. Las discordancias se repartieron en ambos sentidos: la app acertó en seis casos que el experto erró y el experto en cuatro que erró la app. La prueba de McNemar no detectó diferencia (p = 0.754), de modo que ambos desempeños son estadísticamente indistinguibles con este tamaño de muestra.</w:t>
+        <w:t xml:space="preserve">Categoría de afección. La app alcanzó exactitud de 0.917 (F1 macro = 0.914) y el experto, 0.883 (F1 macro 0.888) frente a la verdad de campo. Las discordancias se repartieron en ambos sentidos: la app acertó en seis casos que el experto erró y el experto en cuatro que erró la app. La prueba de McNemar no detectó diferencia (p = 0.754), de modo que ambos desempeños son estadísticamente indistinguibles con este tamaño de muestra.</w:t>
       </w:r>
     </w:p>
     <w:p>
@@ -2243,7 +2232,7 @@
         <w:pStyle w:val="Textoindependiente"/>
       </w:pPr>
       <w:r>
-        <w:t>La conversión a TensorFlow Lite en float32 reproduce exactamente el desempeño de los modelos Keras, lo que verifica la fidelidad de la exportación. La cuantización a enteros de 8 bits, en cambio, tiene un costo desigual: es prácticamente nulo en el clasificador de estado sanitario y apreciable en el de patógeno (Tabla 4). Por ello la configuración desplegada cuantiza el segmentador y M1, y conserva M2 en float32, con lo que la exactitud reportada corresponde a los modelos efectivamente desplegados.</w:t>
+        <w:t xml:space="preserve">La conversión a TensorFlow Lite en float32 reproduce exactamente el desempeño de los modelos Keras en los tres casos, lo que verifica la fidelidad de la exportación. La cuantización a enteros de 8 bits tiene, en cambio, un costo desigual según la etapa: es prácticamente nulo en el clasificador de estado sanitario y apreciable en el de categoría de afección (Tabla 4). El segmentador se evaluó sobre el mismo conjunto reservado que la Tabla 1, con las tres variantes y las mismas métricas (Tabla 5): la cuantización le cuesta 0.0003 de recall de hoja, un orden de magnitud por debajo de cualquier diferencia interpretable, de modo que la reducción de tamaño resulta gratuita en términos de exactitud. Por ello la configuración desplegada cuantiza el segmentador y M1, y conserva M2 en float32, con lo que las cifras reportadas corresponden a los modelos efectivamente desplegados.</w:t>
       </w:r>
     </w:p>
     <w:p>
@@ -3014,6 +3003,409 @@
     </w:tbl>
     <w:p>
       <w:pPr>
+        <w:pStyle w:val="Textoindependiente"/>
+        <w:spacing w:after="0" w:line="240" w:lineRule="auto"/>
+        <w:jc w:val="left"/>
+      </w:pPr>
+      <w:r>
+        <w:rPr>
+          <w:b/>
+        </w:rPr>
+        <w:t xml:space="preserve">Tabla 5</w:t>
+      </w:r>
+    </w:p>
+    <w:p>
+      <w:pPr>
+        <w:pStyle w:val="Textoindependiente"/>
+        <w:spacing w:after="80" w:line="240" w:lineRule="auto"/>
+        <w:jc w:val="left"/>
+      </w:pPr>
+      <w:r>
+        <w:rPr>
+          <w:i/>
+        </w:rPr>
+        <w:t xml:space="preserve">Desempeño del Segmentador Según la Variante Exportada Sobre el Mismo Conjunto Reservado.</w:t>
+      </w:r>
+    </w:p>
+    <w:tbl>
+      <w:tblPr>
+        <w:tblStyle w:val="TableNormal"/>
+        <w:tblW w:w="0" w:type="auto"/>
+        <w:tblBorders>
+          <w:top w:val="single" w:sz="6" w:space="0" w:color="000000"/>
+          <w:left w:val="nil"/>
+          <w:bottom w:val="single" w:sz="6" w:space="0" w:color="000000"/>
+          <w:right w:val="nil"/>
+          <w:insideH w:val="nil"/>
+          <w:insideV w:val="nil"/>
+        </w:tblBorders>
+        <w:tblLook w:val="04A0" w:firstRow="1" w:lastRow="0" w:firstColumn="1" w:lastColumn="0" w:noHBand="0" w:noVBand="1"/>
+      </w:tblPr>
+      <w:tblGrid>
+        <w:gridCol w:w="1560"/>
+        <w:gridCol w:w="1560"/>
+        <w:gridCol w:w="1560"/>
+        <w:gridCol w:w="1560"/>
+        <w:gridCol w:w="1560"/>
+        <w:gridCol w:w="1560"/>
+      </w:tblGrid>
+      <w:tr>
+        <w:tc>
+          <w:tcPr>
+            <w:tcW w:w="1560" w:type="dxa"/>
+            <w:tcBorders>
+              <w:bottom w:val="single" w:sz="6" w:space="0" w:color="000000"/>
+            </w:tcBorders>
+          </w:tcPr>
+          <w:p>
+            <w:pPr>
+              <w:spacing w:after="40"/>
+              <w:jc w:val="center"/>
+            </w:pPr>
+            <w:r>
+              <w:rPr>
+                <w:b/>
+                <w:sz w:val="20"/>
+              </w:rPr>
+              <w:t xml:space="preserve">Variante</w:t>
+            </w:r>
+          </w:p>
+        </w:tc>
+        <w:tc>
+          <w:tcPr>
+            <w:tcW w:w="1560" w:type="dxa"/>
+            <w:tcBorders>
+              <w:bottom w:val="single" w:sz="6" w:space="0" w:color="000000"/>
+            </w:tcBorders>
+          </w:tcPr>
+          <w:p>
+            <w:pPr>
+              <w:spacing w:after="40"/>
+              <w:jc w:val="center"/>
+            </w:pPr>
+            <w:r>
+              <w:rPr>
+                <w:b/>
+                <w:sz w:val="20"/>
+              </w:rPr>
+              <w:t xml:space="preserve">Tamaño (MB)</w:t>
+            </w:r>
+          </w:p>
+        </w:tc>
+        <w:tc>
+          <w:tcPr>
+            <w:tcW w:w="1560" w:type="dxa"/>
+            <w:tcBorders>
+              <w:bottom w:val="single" w:sz="6" w:space="0" w:color="000000"/>
+            </w:tcBorders>
+          </w:tcPr>
+          <w:p>
+            <w:pPr>
+              <w:spacing w:after="40"/>
+              <w:jc w:val="center"/>
+            </w:pPr>
+            <w:r>
+              <w:rPr>
+                <w:b/>
+                <w:sz w:val="20"/>
+              </w:rPr>
+              <w:t xml:space="preserve">Recall de hoja</w:t>
+            </w:r>
+          </w:p>
+        </w:tc>
+        <w:tc>
+          <w:tcPr>
+            <w:tcW w:w="1560" w:type="dxa"/>
+            <w:tcBorders>
+              <w:bottom w:val="single" w:sz="6" w:space="0" w:color="000000"/>
+            </w:tcBorders>
+          </w:tcPr>
+          <w:p>
+            <w:pPr>
+              <w:spacing w:after="40"/>
+              <w:jc w:val="center"/>
+            </w:pPr>
+            <w:r>
+              <w:rPr>
+                <w:b/>
+                <w:sz w:val="20"/>
+              </w:rPr>
+              <w:t xml:space="preserve">Dice</w:t>
+            </w:r>
+          </w:p>
+        </w:tc>
+        <w:tc>
+          <w:tcPr>
+            <w:tcW w:w="1560" w:type="dxa"/>
+            <w:tcBorders>
+              <w:bottom w:val="single" w:sz="6" w:space="0" w:color="000000"/>
+            </w:tcBorders>
+          </w:tcPr>
+          <w:p>
+            <w:pPr>
+              <w:spacing w:after="40"/>
+              <w:jc w:val="center"/>
+            </w:pPr>
+            <w:r>
+              <w:rPr>
+                <w:b/>
+                <w:sz w:val="20"/>
+              </w:rPr>
+              <w:t xml:space="preserve">IoU</w:t>
+            </w:r>
+          </w:p>
+        </w:tc>
+      </w:tr>
+      <w:tr>
+        <w:tc>
+          <w:tcPr>
+            <w:tcW w:w="1560" w:type="dxa"/>
+          </w:tcPr>
+          <w:p>
+            <w:pPr>
+              <w:spacing w:after="40"/>
+            </w:pPr>
+            <w:r>
+              <w:rPr>
+                <w:sz w:val="20"/>
+              </w:rPr>
+              <w:lastRenderedPageBreak/>
+              <w:t xml:space="preserve">Keras</w:t>
+            </w:r>
+          </w:p>
+        </w:tc>
+        <w:tc>
+          <w:tcPr>
+            <w:tcW w:w="1560" w:type="dxa"/>
+          </w:tcPr>
+          <w:p>
+            <w:pPr>
+              <w:spacing w:after="40"/>
+            </w:pPr>
+            <w:r>
+              <w:rPr>
+                <w:sz w:val="20"/>
+              </w:rPr>
+              <w:t xml:space="preserve">515.87</w:t>
+            </w:r>
+          </w:p>
+        </w:tc>
+        <w:tc>
+          <w:tcPr>
+            <w:tcW w:w="1560" w:type="dxa"/>
+          </w:tcPr>
+          <w:p>
+            <w:pPr>
+              <w:spacing w:after="40"/>
+            </w:pPr>
+            <w:r>
+              <w:rPr>
+                <w:sz w:val="20"/>
+              </w:rPr>
+              <w:t xml:space="preserve">0.9739</w:t>
+            </w:r>
+          </w:p>
+        </w:tc>
+        <w:tc>
+          <w:tcPr>
+            <w:tcW w:w="1560" w:type="dxa"/>
+          </w:tcPr>
+          <w:p>
+            <w:pPr>
+              <w:spacing w:after="40"/>
+            </w:pPr>
+            <w:r>
+              <w:rPr>
+                <w:sz w:val="20"/>
+              </w:rPr>
+              <w:t xml:space="preserve">0.8849</w:t>
+            </w:r>
+          </w:p>
+        </w:tc>
+        <w:tc>
+          <w:tcPr>
+            <w:tcW w:w="1560" w:type="dxa"/>
+          </w:tcPr>
+          <w:p>
+            <w:pPr>
+              <w:spacing w:after="40"/>
+            </w:pPr>
+            <w:r>
+              <w:rPr>
+                <w:sz w:val="20"/>
+              </w:rPr>
+              <w:t xml:space="preserve">0.8084</w:t>
+            </w:r>
+          </w:p>
+        </w:tc>
+      </w:tr>
+      <w:tr>
+        <w:tc>
+          <w:tcPr>
+            <w:tcW w:w="1560" w:type="dxa"/>
+          </w:tcPr>
+          <w:p>
+            <w:pPr>
+              <w:spacing w:after="40"/>
+            </w:pPr>
+            <w:r>
+              <w:rPr>
+                <w:sz w:val="20"/>
+              </w:rPr>
+              <w:t xml:space="preserve">TFLite float32</w:t>
+            </w:r>
+          </w:p>
+        </w:tc>
+        <w:tc>
+          <w:tcPr>
+            <w:tcW w:w="1560" w:type="dxa"/>
+          </w:tcPr>
+          <w:p>
+            <w:pPr>
+              <w:spacing w:after="40"/>
+            </w:pPr>
+            <w:r>
+              <w:rPr>
+                <w:sz w:val="20"/>
+              </w:rPr>
+              <w:t xml:space="preserve">175.38</w:t>
+            </w:r>
+          </w:p>
+        </w:tc>
+        <w:tc>
+          <w:tcPr>
+            <w:tcW w:w="1560" w:type="dxa"/>
+          </w:tcPr>
+          <w:p>
+            <w:pPr>
+              <w:spacing w:after="40"/>
+            </w:pPr>
+            <w:r>
+              <w:rPr>
+                <w:sz w:val="20"/>
+              </w:rPr>
+              <w:t xml:space="preserve">0.9739</w:t>
+            </w:r>
+          </w:p>
+        </w:tc>
+        <w:tc>
+          <w:tcPr>
+            <w:tcW w:w="1560" w:type="dxa"/>
+          </w:tcPr>
+          <w:p>
+            <w:pPr>
+              <w:spacing w:after="40"/>
+            </w:pPr>
+            <w:r>
+              <w:rPr>
+                <w:sz w:val="20"/>
+              </w:rPr>
+              <w:t xml:space="preserve">0.8849</w:t>
+            </w:r>
+          </w:p>
+        </w:tc>
+        <w:tc>
+          <w:tcPr>
+            <w:tcW w:w="1560" w:type="dxa"/>
+          </w:tcPr>
+          <w:p>
+            <w:pPr>
+              <w:spacing w:after="40"/>
+            </w:pPr>
+            <w:r>
+              <w:rPr>
+                <w:sz w:val="20"/>
+              </w:rPr>
+              <w:t xml:space="preserve">0.8084</w:t>
+            </w:r>
+          </w:p>
+        </w:tc>
+      </w:tr>
+      <w:tr>
+        <w:tc>
+          <w:tcPr>
+            <w:tcW w:w="1560" w:type="dxa"/>
+          </w:tcPr>
+          <w:p>
+            <w:pPr>
+              <w:spacing w:after="40"/>
+            </w:pPr>
+            <w:r>
+              <w:rPr>
+                <w:sz w:val="20"/>
+              </w:rPr>
+              <w:t xml:space="preserve">TFLite int8</w:t>
+            </w:r>
+          </w:p>
+        </w:tc>
+        <w:tc>
+          <w:tcPr>
+            <w:tcW w:w="1560" w:type="dxa"/>
+          </w:tcPr>
+          <w:p>
+            <w:pPr>
+              <w:spacing w:after="40"/>
+            </w:pPr>
+            <w:r>
+              <w:rPr>
+                <w:sz w:val="20"/>
+              </w:rPr>
+              <w:t xml:space="preserve">44.66</w:t>
+            </w:r>
+          </w:p>
+        </w:tc>
+        <w:tc>
+          <w:tcPr>
+            <w:tcW w:w="1560" w:type="dxa"/>
+          </w:tcPr>
+          <w:p>
+            <w:pPr>
+              <w:spacing w:after="40"/>
+            </w:pPr>
+            <w:r>
+              <w:rPr>
+                <w:sz w:val="20"/>
+              </w:rPr>
+              <w:t xml:space="preserve">0.9736</w:t>
+            </w:r>
+          </w:p>
+        </w:tc>
+        <w:tc>
+          <w:tcPr>
+            <w:tcW w:w="1560" w:type="dxa"/>
+          </w:tcPr>
+          <w:p>
+            <w:pPr>
+              <w:spacing w:after="40"/>
+            </w:pPr>
+            <w:r>
+              <w:rPr>
+                <w:sz w:val="20"/>
+              </w:rPr>
+              <w:t xml:space="preserve">0.8847</w:t>
+            </w:r>
+          </w:p>
+        </w:tc>
+        <w:tc>
+          <w:tcPr>
+            <w:tcW w:w="1560" w:type="dxa"/>
+          </w:tcPr>
+          <w:p>
+            <w:pPr>
+              <w:spacing w:after="40"/>
+            </w:pPr>
+            <w:r>
+              <w:rPr>
+                <w:sz w:val="20"/>
+              </w:rPr>
+              <w:t xml:space="preserve">0.808</w:t>
+            </w:r>
+          </w:p>
+        </w:tc>
+      </w:tr>
+    </w:tbl>
+    <w:p>
+      <w:pPr>
         <w:pStyle w:val="Ttulo2"/>
       </w:pPr>
       <w:r>
@@ -3028,7 +3420,7 @@
         <w:pStyle w:val="Textoindependiente"/>
       </w:pPr>
       <w:r>
-        <w:t>El estudio de ablación (Tabla 5) desmonta un componente a la vez desde la configuración completa, con el presupuesto del modelo final, la misma partición y tres semillas. El aislamiento de la hoja mediante M_seg es el único componente cuyo aporte supera la variabilidad entre semillas; sustituir esa entrada por la imagen cruda resulta incluso inferior a usar una sola entrada, de modo que el beneficio proviene de la información complementaria de la hoja aislada y no de las dos ramas en sí. Shades-of-Gray y el promediado de pesos no mejoran la exactitud en este test, coherente en el primer caso con su propósito de robustez ante iluminación variable, no medida aquí. Una verificación independiente al mismo presupuesto, con una sola semilla, contrastó la configuración completa (0.980) con un EfficientNetB0 de una sola entrada sobre la imagen cruda (0.963); por tratarse de una única repetición, esa diferencia no es separable de la variabilidad entre semillas observada en la ablación.</w:t>
+        <w:t xml:space="preserve">El estudio de ablación (Tabla 6) desmonta un componente a la vez desde la configuración completa, con el presupuesto del modelo final, la misma partición y tres semillas. El aislamiento de la hoja mediante M_seg es el único componente cuyo aporte supera la variabilidad entre semillas; sustituir esa entrada por la imagen cruda resulta incluso inferior a usar una sola entrada, de modo que el beneficio proviene de la información complementaria de la hoja aislada y no de las dos ramas en sí. Shades-of-Gray y el promediado de pesos no mejoran la exactitud en este test, coherente en el primer caso con su propósito de robustez ante iluminación variable, no medida aquí. Una verificación independiente al mismo presupuesto, con una sola semilla, contrastó la configuración completa (0.980) con un EfficientNetB0 de una sola entrada sobre la imagen cruda (0.963); por tratarse de una única repetición, esa diferencia no es separable de la variabilidad entre semillas observada en la ablación.</w:t>
       </w:r>
     </w:p>
     <w:p>
@@ -3041,7 +3433,7 @@
         <w:rPr>
           <w:b/>
         </w:rPr>
-        <w:t>Tabla 5</w:t>
+        <w:t xml:space="preserve">Tabla 6</w:t>
       </w:r>
     </w:p>
     <w:p>
@@ -3380,7 +3772,7 @@
         <w:pStyle w:val="Textoindependiente"/>
       </w:pPr>
       <w:r>
-        <w:t xml:space="preserve">La inferencia se ejecuta en el dispositivo sin conectividad, lo que preserva la privacidad al no transmitir imágenes. La severidad CIELab ofrece trazabilidad visual y desagrega clorosis, necrosis y defoliación (MAE 6.5 % vs. experto), y la integración de clima (Open-Meteo) ajusta la urgencia sin confirmar el diagnóstico.</w:t>
+        <w:t xml:space="preserve">La inferencia se ejecuta en el dispositivo sin conectividad, lo que preserva la privacidad al no transmitir imágenes. La severidad CIELab ofrece trazabilidad visual y desagrega clorosis, necrosis y pérdida de tejido foliar (MAE 6.5 % vs. experto), y la integración de clima (Open-Meteo) ajusta la urgencia sin confirmar el diagnóstico.</w:t>
       </w:r>
     </w:p>
     <w:p>
@@ -3437,11 +3829,7 @@
         <w:pStyle w:val="Textoindependiente"/>
       </w:pPr>
       <w:r>
-        <w:t xml:space="preserve">Falta validación con imágenes propias de Santa Cruz. La validación experta usó 60 hojas y un evaluador, sin acuerdo inter-evaluador y con McNemar no significativo (p = 0.0625), por lo que el contraste app-experto es orientativo. La verdad de campo del patógeno </w:t>
-      </w:r>
-      <w:r>
-        <w:lastRenderedPageBreak/>
-        <w:t>proviene de la etiqueta del dataset, no de laboratorio. Aunque la deduplicación combina MD5 y pHash sin fuga entrenamiento–prueba, no existe partición por procedencia, de modo que las métricas reflejan desempeño interno del corpus. El conjunto curado combina fuentes con licencias mixtas, algunas no especificadas y una de tipo no comercial, por lo que se comparte con fines de investigación académica y no debe asumirse reutilizable comercialmente. Los umbrales CIELab son fijos y requieren recalibración; el aporte de la normalización cromática y del promediado de pesos no pudo verificarse fuera del dominio de entrenamiento; y el desempeño puede degradarse bajo iluminación extrema u oclusión severa.</w:t>
+        <w:t xml:space="preserve">Falta validación con imágenes propias de Santa Cruz. La validación experta usó 60 hojas y un evaluador, sin acuerdo inter-evaluador y con McNemar no significativo (p = 0.754), por lo que el contraste app-experto es orientativo. La verdad de campo de la categoría proviene de la etiqueta del conjunto de datos, no de diagnóstico de laboratorio, por lo que la clase asignada refleja el criterio de la fuente original. Aunque la deduplicación combina MD5 y pHash sin fuga entrenamiento–prueba, no existe partición por procedencia, de modo que las métricas reflejan desempeño interno del corpus. El conjunto curado combina fuentes con licencias mixtas, algunas no especificadas y una de tipo no comercial, por lo que se comparte con fines de investigación académica y no debe asumirse reutilizable comercialmente. Los umbrales CIELab son fijos y requieren recalibración; el aporte de la normalización cromática y del promediado de pesos no pudo verificarse fuera del dominio de entrenamiento; y el desempeño puede degradarse bajo iluminación extrema u oclusión severa.</w:t>
       </w:r>
     </w:p>
     <w:p>
@@ -3457,7 +3845,7 @@
         <w:pStyle w:val="Textoindependiente"/>
       </w:pPr>
       <w:r>
-        <w:t xml:space="preserve">Se desarrolló y evaluó Glycine Vision, un sistema modular de apoyo al triaje fitosanitario en soya que integra segmentación hoja–fondo, clasificación en cascada de doble entrada y estimación interpretable de severidad por CIELab con inferencia local. Sobre test independientes alcanzó recall de hoja de 0.977, exactitud de 0.980 en el estado sanitario (recall perfecto en la clase enferma) y 0.969 en el patógeno (F1 macro 0.968); frente al experto, la severidad concordó (r = 0.953; MAE 6.5 %) y el diagnóstico resultó estadísticamente indistinguible (0.917 vs. 0.883; McNemar p = 0.754). Un estudio de ablación al presupuesto completo identificó el aislamiento de la hoja mediante M_seg como el componente de mayor aporte a la clasificación del patógeno.</w:t>
+        <w:t xml:space="preserve">Se desarrolló y evaluó Glycine Vision, un sistema modular de apoyo al triaje fitosanitario en soya que integra segmentación hoja–fondo, clasificación en cascada de doble entrada y estimación interpretable de severidad por CIELab con inferencia local. Sobre test independientes alcanzó recall de hoja de 0.974, exactitud de 0.980 en el estado sanitario (recall perfecto en la clase enferma) y 0.969 en la categoría de afección (F1 macro 0.968); frente al experto, la severidad concordó (r = 0.953; MAE 6.5 %) y el diagnóstico resultó estadísticamente indistinguible (0.917 vs. 0.883; McNemar p = 0.754). Un estudio de ablación al presupuesto completo identificó el aislamiento de la hoja mediante M_seg como el componente de mayor aporte a la clasificación de la categoría de afección.</w:t>
       </w:r>
     </w:p>
     <w:p>
@@ -3489,6 +3877,7 @@
         <w:r>
           <w:rPr>
             <w:rStyle w:val="Hipervnculo"/>
+            <w:u w:val="none"/>
           </w:rPr>
           <w:t>https://doi.org/10.1016/j.compag.2022.107449</w:t>
         </w:r>
@@ -3507,6 +3896,7 @@
         <w:r>
           <w:rPr>
             <w:rStyle w:val="Hipervnculo"/>
+            <w:u w:val="none"/>
           </w:rPr>
           <w:t>https://doi.org/10.1007/s40858-021-00439-z</w:t>
         </w:r>
@@ -3525,6 +3915,7 @@
         <w:r>
           <w:rPr>
             <w:rStyle w:val="Hipervnculo"/>
+            <w:u w:val="none"/>
           </w:rPr>
           <w:t>https://doi.org/10.1016/j.compag.2021.106542</w:t>
         </w:r>
@@ -3543,6 +3934,7 @@
         <w:r>
           <w:rPr>
             <w:rStyle w:val="Hipervnculo"/>
+            <w:u w:val="none"/>
           </w:rPr>
           <w:t>https://doi.org/10.4236/jcc.2023.119004</w:t>
         </w:r>
@@ -3561,6 +3953,7 @@
         <w:r>
           <w:rPr>
             <w:rStyle w:val="Hipervnculo"/>
+            <w:u w:val="none"/>
           </w:rPr>
           <w:t>https://doi.org/10.2352/CIC.2004.12.1.art00008</w:t>
         </w:r>
@@ -3579,6 +3972,7 @@
         <w:r>
           <w:rPr>
             <w:rStyle w:val="Hipervnculo"/>
+            <w:u w:val="none"/>
           </w:rPr>
           <w:t>https://doi.org/10.1111/j.1364-3703.2009.00589.x</w:t>
         </w:r>
@@ -3591,12 +3985,13 @@
         <w:jc w:val="both"/>
       </w:pPr>
       <w:r>
-        <w:t>Goshika, S., Meksem, K., Ahmed, K. R., &amp; Lakhssassi, N. (2024). Deep learning model for classifying and evaluating soybean leaf disease damage. International Journal of Molecular Sciences, 25(1), 106. https://doi.org/10.3390/ijms25010106</w:t>
+        <w:t>Goshika, S., Meksem, K., Ahmed, K. R., &amp; Lakhssassi, N. (2024). Deep learning model for classifying and evaluating soybean leaf disease damage. International Journal of Molecular Sciences, 25(1), 106. </w:t>
       </w:r>
       <w:hyperlink r:id="rId25" w:history="1">
         <w:r>
           <w:rPr>
             <w:rStyle w:val="Hipervnculo"/>
+            <w:u w:val="none"/>
           </w:rPr>
           <w:t>https://doi.org/10.3390/ijms25010106</w:t>
         </w:r>
@@ -3615,6 +4010,7 @@
         <w:r>
           <w:rPr>
             <w:rStyle w:val="Hipervnculo"/>
+            <w:u w:val="none"/>
           </w:rPr>
           <w:t>https://doi.org/10.1109/CVPR.2016.90</w:t>
         </w:r>
@@ -3633,6 +4029,7 @@
         <w:r>
           <w:rPr>
             <w:rStyle w:val="Hipervnculo"/>
+            <w:u w:val="none"/>
           </w:rPr>
           <w:t>https://doi.org/10.3389/fmicb.2023.1304205</w:t>
         </w:r>
@@ -3651,6 +4048,7 @@
         <w:r>
           <w:rPr>
             <w:rStyle w:val="Hipervnculo"/>
+            <w:u w:val="none"/>
           </w:rPr>
           <w:t>https://github.com/alejandroramirezucb/glycine-vision-dss</w:t>
         </w:r>
@@ -3669,6 +4067,7 @@
         <w:r>
           <w:rPr>
             <w:rStyle w:val="Hipervnculo"/>
+            <w:u w:val="none"/>
           </w:rPr>
           <w:t>https://huggingface.co/alejandroramirezucb/glycine-vision-models</w:t>
         </w:r>
@@ -3687,18 +4086,21 @@
         <w:r>
           <w:rPr>
             <w:rStyle w:val="Hipervnculo"/>
+            <w:u w:val="none"/>
           </w:rPr>
           <w:t>https://huggingface.co/datasets/alejandroramirezucb</w:t>
         </w:r>
         <w:r>
           <w:rPr>
             <w:rStyle w:val="Hipervnculo"/>
+            <w:u w:val="none"/>
           </w:rPr>
           <w:softHyphen/>
         </w:r>
         <w:r>
           <w:rPr>
             <w:rStyle w:val="Hipervnculo"/>
+            <w:u w:val="none"/>
           </w:rPr>
           <w:t>/soybean_image_dataset</w:t>
         </w:r>
@@ -3717,6 +4119,7 @@
         <w:r>
           <w:rPr>
             <w:rStyle w:val="Hipervnculo"/>
+            <w:u w:val="none"/>
           </w:rPr>
           <w:t>https://doi.org/10.1007/978-3-319-24574-4_28</w:t>
         </w:r>
@@ -3735,6 +4138,7 @@
         <w:r>
           <w:rPr>
             <w:rStyle w:val="Hipervnculo"/>
+            <w:u w:val="none"/>
           </w:rPr>
           <w:t>https://doi.org/10.1038/s41597-026-07092-8</w:t>
         </w:r>
@@ -3753,6 +4157,7 @@
         <w:r>
           <w:rPr>
             <w:rStyle w:val="Hipervnculo"/>
+            <w:u w:val="none"/>
           </w:rPr>
           <w:t>https://doi.org/10.48550/arXiv.1905.11946</w:t>
         </w:r>
@@ -3771,6 +4176,7 @@
         <w:r>
           <w:rPr>
             <w:rStyle w:val="Hipervnculo"/>
+            <w:u w:val="none"/>
           </w:rPr>
           <w:t>https://ipad.fas.usda.gov/countrysummary/Default.aspx?id=BL&amp;crop=Soybean</w:t>
         </w:r>
@@ -3849,7 +4255,7 @@
         <w:pStyle w:val="Textoindependiente"/>
       </w:pPr>
       <w:r>
-        <w:t>El estudio se realizó respetando el Código de ética y buenas prácticas editoriales de publicación.</w:t>
+        <w:t xml:space="preserve">El evaluador experto que participó en la validación de uso lo hizo de forma voluntaria, fue informado del propósito del estudio y del uso académico de sus valoraciones, y otorgó su consentimiento para incorporarlas al análisis. No se recogieron datos personales ni identificables, y las imágenes proceden de conjuntos públicos de investigación, por lo que no se requirió consentimiento de terceros. El estudio se realizó respetando el Código de ética y buenas prácticas editoriales de publicación.</w:t>
       </w:r>
     </w:p>
     <w:p>

</xml_diff>